<commit_message>
Journalspørgsmål i dafnier, DNA i kiwi og gærforsøg
Dafnier og koffein: ny Databehandling med gennemsnit, procentvis
ændring og dosis-respons-kurve. DNA i kiwi: kvalitativ, får resultat-
afsnit og originalens spørgsmål. Gærforsøg: fortolkningen flyttet fra
Databehandling til Journalspørgsmål efter originalens diskussion.

Co-Authored-By: Claude Opus 5.5 <noreply@anthropic.com>
</commit_message>
<xml_diff>
--- a/Øvelser/Biologi/dafnier-og-koffein/dafnier-og-koffein.docx
+++ b/Øvelser/Biologi/dafnier-og-koffein/dafnier-og-koffein.docx
@@ -1,6 +1,6 @@
 
 <file path=word/document.xml><?xml version="1.0" encoding="utf-8"?>
-<w:document xmlns:a="http://schemas.openxmlformats.org/drawingml/2006/main" xmlns:pic="http://schemas.openxmlformats.org/drawingml/2006/picture" xmlns:r="http://schemas.openxmlformats.org/officeDocument/2006/relationships" xmlns:w="http://schemas.openxmlformats.org/wordprocessingml/2006/main" xmlns:wp="http://schemas.openxmlformats.org/drawingml/2006/wordprocessingDrawing">
+<w:document xmlns:a="http://schemas.openxmlformats.org/drawingml/2006/main" xmlns:m="http://schemas.openxmlformats.org/officeDocument/2006/math" xmlns:pic="http://schemas.openxmlformats.org/drawingml/2006/picture" xmlns:r="http://schemas.openxmlformats.org/officeDocument/2006/relationships" xmlns:w="http://schemas.openxmlformats.org/wordprocessingml/2006/main" xmlns:wp="http://schemas.openxmlformats.org/drawingml/2006/wordprocessingDrawing">
   <w:body>
     <w:p>
       <w:pPr>
@@ -1255,6 +1255,641 @@
       </w:tr>
     </w:tbl>
     <w:bookmarkEnd w:id="34"/>
+    <w:bookmarkStart w:id="36" w:name="databehandling"/>
+    <w:p>
+      <w:pPr>
+        <w:pStyle w:val="Heading2"/>
+      </w:pPr>
+      <w:r>
+        <w:t xml:space="preserve">Databehandling</w:t>
+      </w:r>
+    </w:p>
+    <w:p>
+      <w:pPr>
+        <w:pStyle w:val="Compact"/>
+        <w:numPr>
+          <w:ilvl w:val="0"/>
+          <w:numId w:val="1004"/>
+        </w:numPr>
+      </w:pPr>
+      <w:r>
+        <w:t xml:space="preserve">Beregn for hver koncentration gennemsnittet af de tre tællinger, og skriv det i</w:t>
+      </w:r>
+      <w:r>
+        <w:t xml:space="preserve"> </w:t>
+      </w:r>
+      <w:hyperlink w:anchor="tbl-1">
+        <w:r>
+          <w:rPr>
+            <w:rStyle w:val="Hyperlink"/>
+          </w:rPr>
+          <w:t xml:space="preserve">Tabel 1</w:t>
+        </w:r>
+      </w:hyperlink>
+      <w:r>
+        <w:t xml:space="preserve">:</w:t>
+      </w:r>
+    </w:p>
+    <w:p>
+      <w:pPr>
+        <w:pStyle w:val="FirstParagraph"/>
+      </w:pPr>
+      <m:oMathPara>
+        <m:oMathParaPr>
+          <m:jc m:val="center"/>
+        </m:oMathParaPr>
+        <m:oMath>
+          <m:r>
+            <m:rPr>
+              <m:nor/>
+              <m:sty m:val="p"/>
+            </m:rPr>
+            <m:t>Gennemsnitlig puls</m:t>
+          </m:r>
+          <m:r>
+            <m:rPr>
+              <m:sty m:val="p"/>
+            </m:rPr>
+            <m:t>=</m:t>
+          </m:r>
+          <m:f>
+            <m:fPr>
+              <m:type m:val="bar"/>
+            </m:fPr>
+            <m:num>
+              <m:r>
+                <m:rPr>
+                  <m:nor/>
+                  <m:sty m:val="p"/>
+                </m:rPr>
+                <m:t>måling 1</m:t>
+              </m:r>
+              <m:r>
+                <m:rPr>
+                  <m:sty m:val="p"/>
+                </m:rPr>
+                <m:t>+</m:t>
+              </m:r>
+              <m:r>
+                <m:rPr>
+                  <m:nor/>
+                  <m:sty m:val="p"/>
+                </m:rPr>
+                <m:t>måling 2</m:t>
+              </m:r>
+              <m:r>
+                <m:rPr>
+                  <m:sty m:val="p"/>
+                </m:rPr>
+                <m:t>+</m:t>
+              </m:r>
+              <m:r>
+                <m:rPr>
+                  <m:nor/>
+                  <m:sty m:val="p"/>
+                </m:rPr>
+                <m:t>måling 3</m:t>
+              </m:r>
+            </m:num>
+            <m:den>
+              <m:r>
+                <m:t>3</m:t>
+              </m:r>
+            </m:den>
+          </m:f>
+        </m:oMath>
+      </m:oMathPara>
+    </w:p>
+    <w:p>
+      <w:pPr>
+        <w:pStyle w:val="Compact"/>
+        <w:numPr>
+          <w:ilvl w:val="0"/>
+          <w:numId w:val="1005"/>
+        </w:numPr>
+      </w:pPr>
+      <w:r>
+        <w:t xml:space="preserve">Beregn for hver koncentration, hvor mange procent pulsen har ændret sig i forhold til pulsen uden koffein:</w:t>
+      </w:r>
+    </w:p>
+    <w:p>
+      <w:pPr>
+        <w:pStyle w:val="FirstParagraph"/>
+      </w:pPr>
+      <m:oMathPara>
+        <m:oMathParaPr>
+          <m:jc m:val="center"/>
+        </m:oMathParaPr>
+        <m:oMath>
+          <m:r>
+            <m:rPr>
+              <m:nor/>
+              <m:sty m:val="p"/>
+            </m:rPr>
+            <m:t>Ændring (%)</m:t>
+          </m:r>
+          <m:r>
+            <m:rPr>
+              <m:sty m:val="p"/>
+            </m:rPr>
+            <m:t>=</m:t>
+          </m:r>
+          <m:f>
+            <m:fPr>
+              <m:type m:val="bar"/>
+            </m:fPr>
+            <m:num>
+              <m:r>
+                <m:rPr>
+                  <m:nor/>
+                  <m:sty m:val="p"/>
+                </m:rPr>
+                <m:t>puls med koffein</m:t>
+              </m:r>
+              <m:r>
+                <m:rPr>
+                  <m:sty m:val="p"/>
+                </m:rPr>
+                <m:t>−</m:t>
+              </m:r>
+              <m:r>
+                <m:rPr>
+                  <m:nor/>
+                  <m:sty m:val="p"/>
+                </m:rPr>
+                <m:t>puls ved 0 mg/L</m:t>
+              </m:r>
+            </m:num>
+            <m:den>
+              <m:r>
+                <m:rPr>
+                  <m:nor/>
+                  <m:sty m:val="p"/>
+                </m:rPr>
+                <m:t>puls ved 0 mg/L</m:t>
+              </m:r>
+            </m:den>
+          </m:f>
+          <m:r>
+            <m:rPr>
+              <m:sty m:val="p"/>
+            </m:rPr>
+            <m:t>⋅</m:t>
+          </m:r>
+          <m:r>
+            <m:t>100</m:t>
+          </m:r>
+        </m:oMath>
+      </m:oMathPara>
+    </w:p>
+    <w:tbl>
+      <w:tblPr>
+        <w:tblStyle w:val="Table"/>
+        <w:tblW w:type="pct" w:w="5000"/>
+        <w:tblLayout w:type="fixed"/>
+        <w:tblLook w:firstRow="0" w:lastRow="0" w:firstColumn="0" w:lastColumn="0" w:noHBand="0" w:noVBand="0" w:val="0000"/>
+      </w:tblPr>
+      <w:tblGrid>
+        <w:gridCol w:w="7920"/>
+      </w:tblGrid>
+      <w:tr>
+        <w:tc>
+          <w:tcPr/>
+          <w:bookmarkStart w:id="35" w:name="tbl-2"/>
+          <w:p>
+            <w:pPr>
+              <w:jc w:val="center"/>
+            </w:pPr>
+            <w:pPr>
+              <w:jc w:val="left"/>
+              <w:spacing w:before="200"/>
+              <w:pStyle w:val="ImageCaption"/>
+            </w:pPr>
+            <w:r>
+              <w:t xml:space="preserve">Tabel 2: Udregnet gennemsnit og procentvis ændring af pulsen.</w:t>
+            </w:r>
+          </w:p>
+          <w:tbl>
+            <w:tblPr>
+              <w:tblStyle w:val="Table"/>
+              <w:tblW w:type="pct" w:w="5000"/>
+              <w:tblLayout w:type="fixed"/>
+              <w:tblLook w:firstRow="1" w:lastRow="0" w:firstColumn="0" w:lastColumn="0" w:noHBand="0" w:noVBand="0" w:val="0020"/>
+            </w:tblPr>
+            <w:tblGrid>
+              <w:gridCol w:w="1267"/>
+              <w:gridCol w:w="950"/>
+              <w:gridCol w:w="950"/>
+              <w:gridCol w:w="950"/>
+              <w:gridCol w:w="950"/>
+              <w:gridCol w:w="950"/>
+              <w:gridCol w:w="950"/>
+              <w:gridCol w:w="950"/>
+            </w:tblGrid>
+            <w:tr>
+              <w:trPr>
+                <w:cantSplit/>
+                <w:tblHeader w:val="on"/>
+              </w:trPr>
+              <w:tc>
+                <w:tcPr/>
+                <w:p>
+                  <w:pPr>
+                    <w:pStyle w:val="Compact"/>
+                    <w:keepNext/>
+                    <w:jc w:val="left"/>
+                    <w:jc w:val="center"/>
+                  </w:pPr>
+                  <w:r>
+                    <w:t xml:space="preserve">Koffeinkoncentration (mg/L)</w:t>
+                  </w:r>
+                </w:p>
+              </w:tc>
+              <w:tc>
+                <w:tcPr/>
+                <w:p>
+                  <w:pPr>
+                    <w:pStyle w:val="Compact"/>
+                    <w:keepNext/>
+                    <w:jc w:val="center"/>
+                    <w:jc w:val="center"/>
+                  </w:pPr>
+                  <w:r>
+                    <w:t xml:space="preserve">0</w:t>
+                  </w:r>
+                </w:p>
+              </w:tc>
+              <w:tc>
+                <w:tcPr/>
+                <w:p>
+                  <w:pPr>
+                    <w:pStyle w:val="Compact"/>
+                    <w:keepNext/>
+                    <w:jc w:val="center"/>
+                    <w:jc w:val="center"/>
+                  </w:pPr>
+                  <w:r>
+                    <w:t xml:space="preserve">18,75</w:t>
+                  </w:r>
+                </w:p>
+              </w:tc>
+              <w:tc>
+                <w:tcPr/>
+                <w:p>
+                  <w:pPr>
+                    <w:pStyle w:val="Compact"/>
+                    <w:keepNext/>
+                    <w:jc w:val="center"/>
+                    <w:jc w:val="center"/>
+                  </w:pPr>
+                  <w:r>
+                    <w:t xml:space="preserve">37,5</w:t>
+                  </w:r>
+                </w:p>
+              </w:tc>
+              <w:tc>
+                <w:tcPr/>
+                <w:p>
+                  <w:pPr>
+                    <w:pStyle w:val="Compact"/>
+                    <w:keepNext/>
+                    <w:jc w:val="center"/>
+                    <w:jc w:val="center"/>
+                  </w:pPr>
+                  <w:r>
+                    <w:t xml:space="preserve">75</w:t>
+                  </w:r>
+                </w:p>
+              </w:tc>
+              <w:tc>
+                <w:tcPr/>
+                <w:p>
+                  <w:pPr>
+                    <w:pStyle w:val="Compact"/>
+                    <w:keepNext/>
+                    <w:jc w:val="center"/>
+                    <w:jc w:val="center"/>
+                  </w:pPr>
+                  <w:r>
+                    <w:t xml:space="preserve">150</w:t>
+                  </w:r>
+                </w:p>
+              </w:tc>
+              <w:tc>
+                <w:tcPr/>
+                <w:p>
+                  <w:pPr>
+                    <w:pStyle w:val="Compact"/>
+                    <w:keepNext/>
+                    <w:jc w:val="center"/>
+                    <w:jc w:val="center"/>
+                  </w:pPr>
+                  <w:r>
+                    <w:t xml:space="preserve">300</w:t>
+                  </w:r>
+                </w:p>
+              </w:tc>
+              <w:tc>
+                <w:tcPr/>
+                <w:p>
+                  <w:pPr>
+                    <w:pStyle w:val="Compact"/>
+                    <w:keepNext/>
+                    <w:jc w:val="center"/>
+                    <w:jc w:val="center"/>
+                  </w:pPr>
+                  <w:r>
+                    <w:t xml:space="preserve">600</w:t>
+                  </w:r>
+                </w:p>
+              </w:tc>
+            </w:tr>
+            <w:tr>
+              <w:trPr>
+                <w:cantSplit/>
+              </w:trPr>
+              <w:tc>
+                <w:tcPr/>
+                <w:p>
+                  <w:pPr>
+                    <w:pStyle w:val="Compact"/>
+                    <w:keepNext/>
+                    <w:jc w:val="left"/>
+                    <w:jc w:val="center"/>
+                  </w:pPr>
+                  <w:r>
+                    <w:t xml:space="preserve">Gennemsnitlig puls (slag/min)</w:t>
+                  </w:r>
+                </w:p>
+              </w:tc>
+              <w:tc>
+                <w:tcPr/>
+                <w:p>
+                  <w:pPr>
+                    <w:pStyle w:val="Compact"/>
+                    <w:keepNext/>
+                  </w:pPr>
+                </w:p>
+              </w:tc>
+              <w:tc>
+                <w:tcPr/>
+                <w:p>
+                  <w:pPr>
+                    <w:pStyle w:val="Compact"/>
+                    <w:keepNext/>
+                  </w:pPr>
+                </w:p>
+              </w:tc>
+              <w:tc>
+                <w:tcPr/>
+                <w:p>
+                  <w:pPr>
+                    <w:pStyle w:val="Compact"/>
+                    <w:keepNext/>
+                  </w:pPr>
+                </w:p>
+              </w:tc>
+              <w:tc>
+                <w:tcPr/>
+                <w:p>
+                  <w:pPr>
+                    <w:pStyle w:val="Compact"/>
+                    <w:keepNext/>
+                  </w:pPr>
+                </w:p>
+              </w:tc>
+              <w:tc>
+                <w:tcPr/>
+                <w:p>
+                  <w:pPr>
+                    <w:pStyle w:val="Compact"/>
+                    <w:keepNext/>
+                  </w:pPr>
+                </w:p>
+              </w:tc>
+              <w:tc>
+                <w:tcPr/>
+                <w:p>
+                  <w:pPr>
+                    <w:pStyle w:val="Compact"/>
+                    <w:keepNext/>
+                  </w:pPr>
+                </w:p>
+              </w:tc>
+              <w:tc>
+                <w:tcPr/>
+                <w:p>
+                  <w:pPr>
+                    <w:pStyle w:val="Compact"/>
+                    <w:keepNext/>
+                  </w:pPr>
+                </w:p>
+              </w:tc>
+            </w:tr>
+            <w:tr>
+              <w:trPr>
+                <w:cantSplit/>
+              </w:trPr>
+              <w:tc>
+                <w:tcPr/>
+                <w:p>
+                  <w:pPr>
+                    <w:pStyle w:val="Compact"/>
+                    <w:jc w:val="left"/>
+                    <w:jc w:val="center"/>
+                  </w:pPr>
+                  <w:r>
+                    <w:t xml:space="preserve">Ændring i forhold til 0 mg/L (%)</w:t>
+                  </w:r>
+                </w:p>
+              </w:tc>
+              <w:tc>
+                <w:tcPr/>
+                <w:p>
+                  <w:pPr>
+                    <w:pStyle w:val="Compact"/>
+                    <w:jc w:val="center"/>
+                    <w:jc w:val="center"/>
+                  </w:pPr>
+                  <w:r>
+                    <w:t xml:space="preserve">0</w:t>
+                  </w:r>
+                </w:p>
+              </w:tc>
+              <w:tc>
+                <w:tcPr/>
+                <w:p>
+                  <w:pPr>
+                    <w:pStyle w:val="Compact"/>
+                  </w:pPr>
+                </w:p>
+              </w:tc>
+              <w:tc>
+                <w:tcPr/>
+                <w:p>
+                  <w:pPr>
+                    <w:pStyle w:val="Compact"/>
+                  </w:pPr>
+                </w:p>
+              </w:tc>
+              <w:tc>
+                <w:tcPr/>
+                <w:p>
+                  <w:pPr>
+                    <w:pStyle w:val="Compact"/>
+                  </w:pPr>
+                </w:p>
+              </w:tc>
+              <w:tc>
+                <w:tcPr/>
+                <w:p>
+                  <w:pPr>
+                    <w:pStyle w:val="Compact"/>
+                  </w:pPr>
+                </w:p>
+              </w:tc>
+              <w:tc>
+                <w:tcPr/>
+                <w:p>
+                  <w:pPr>
+                    <w:pStyle w:val="Compact"/>
+                  </w:pPr>
+                </w:p>
+              </w:tc>
+              <w:tc>
+                <w:tcPr/>
+                <w:p>
+                  <w:pPr>
+                    <w:pStyle w:val="Compact"/>
+                  </w:pPr>
+                </w:p>
+              </w:tc>
+            </w:tr>
+          </w:tbl>
+          <w:bookmarkEnd w:id="35"/>
+          <w:p/>
+        </w:tc>
+      </w:tr>
+    </w:tbl>
+    <w:p>
+      <w:pPr>
+        <w:pStyle w:val="Compact"/>
+        <w:numPr>
+          <w:ilvl w:val="0"/>
+          <w:numId w:val="1006"/>
+        </w:numPr>
+      </w:pPr>
+      <w:r>
+        <w:t xml:space="preserve">Lav en graf (fx i Excel) med koffeinkoncentrationen på x-aksen og den gennemsnitlige puls på y-aksen. Da koncentrationen fordobles fra trin til trin, kan det være en fordel også at prøve en logaritmisk x-akse.</w:t>
+      </w:r>
+    </w:p>
+    <w:p>
+      <w:pPr>
+        <w:pStyle w:val="Compact"/>
+        <w:numPr>
+          <w:ilvl w:val="0"/>
+          <w:numId w:val="1006"/>
+        </w:numPr>
+      </w:pPr>
+      <w:r>
+        <w:t xml:space="preserve">Beskriv grafens form: Stiger pulsen jævnt med koncentrationen, flader den ud, eller falder den igen ved de højeste koncentrationer? Ved hvilken koncentration ses den største virkning?</w:t>
+      </w:r>
+    </w:p>
+    <w:p>
+      <w:pPr>
+        <w:pStyle w:val="Compact"/>
+        <w:numPr>
+          <w:ilvl w:val="0"/>
+          <w:numId w:val="1006"/>
+        </w:numPr>
+      </w:pPr>
+      <w:r>
+        <w:t xml:space="preserve">Sammenlign jeres kurve med en eller to andre gruppers. Ligner de hinanden?</w:t>
+      </w:r>
+    </w:p>
+    <w:bookmarkEnd w:id="36"/>
+    <w:bookmarkStart w:id="37" w:name="journalspørgsmål"/>
+    <w:p>
+      <w:pPr>
+        <w:pStyle w:val="Heading2"/>
+      </w:pPr>
+      <w:r>
+        <w:t xml:space="preserve">Journalspørgsmål</w:t>
+      </w:r>
+    </w:p>
+    <w:p>
+      <w:pPr>
+        <w:pStyle w:val="Compact"/>
+        <w:numPr>
+          <w:ilvl w:val="0"/>
+          <w:numId w:val="1007"/>
+        </w:numPr>
+      </w:pPr>
+      <w:r>
+        <w:t xml:space="preserve">Hvad var jeres hypotese, og blev den be- eller afkræftet af resultaterne?</w:t>
+      </w:r>
+    </w:p>
+    <w:p>
+      <w:pPr>
+        <w:pStyle w:val="Compact"/>
+        <w:numPr>
+          <w:ilvl w:val="0"/>
+          <w:numId w:val="1007"/>
+        </w:numPr>
+      </w:pPr>
+      <w:r>
+        <w:t xml:space="preserve">Koffein virker stimulerende på nervesystemet og hjertet. Forklar ud fra jeres graf, hvordan dafniens hjerte reagerer på koffein, og diskutér, hvad der kan ske ved de højeste koncentrationer.</w:t>
+      </w:r>
+    </w:p>
+    <w:p>
+      <w:pPr>
+        <w:pStyle w:val="Compact"/>
+        <w:numPr>
+          <w:ilvl w:val="0"/>
+          <w:numId w:val="1007"/>
+        </w:numPr>
+      </w:pPr>
+      <w:r>
+        <w:t xml:space="preserve">Dafnier er vekselvarme. Hvorfor er det vigtigt at slukke lyset i mikroskopet mellem tællingerne, og hvordan ville en stigende temperatur påvirke jeres resultater?</w:t>
+      </w:r>
+    </w:p>
+    <w:p>
+      <w:pPr>
+        <w:pStyle w:val="Compact"/>
+        <w:numPr>
+          <w:ilvl w:val="0"/>
+          <w:numId w:val="1007"/>
+        </w:numPr>
+      </w:pPr>
+      <w:r>
+        <w:t xml:space="preserve">I bruger den samme dafnie til alle koncentrationerne. Hvilke fordele og ulemper har det i forhold til at bruge en ny dafnie til hver koncentration? Hvordan kan rækkefølgen af koncentrationerne påvirke resultatet?</w:t>
+      </w:r>
+    </w:p>
+    <w:p>
+      <w:pPr>
+        <w:pStyle w:val="Compact"/>
+        <w:numPr>
+          <w:ilvl w:val="0"/>
+          <w:numId w:val="1007"/>
+        </w:numPr>
+      </w:pPr>
+      <w:r>
+        <w:t xml:space="preserve">En kop kaffe indeholder ca. 60 mg koffein. Hvor mange mg koffein pr. liter blod ville det svare til, hvis koffeinen fordelte sig i et menneskes ca. 5 L blod, og hvordan ligger det i forhold til de koncentrationer, I har brugt? Diskutér, om man kan overføre resultaterne fra dafnier til mennesker.</w:t>
+      </w:r>
+    </w:p>
+    <w:p>
+      <w:pPr>
+        <w:pStyle w:val="Compact"/>
+        <w:numPr>
+          <w:ilvl w:val="0"/>
+          <w:numId w:val="1007"/>
+        </w:numPr>
+      </w:pPr>
+      <w:r>
+        <w:t xml:space="preserve">Hvilke fejlkilder var der i forsøget (fx tælling af hurtige hjerteslag, dafniens tilstand, varme fra lyset), og hvordan påvirker de konklusionen?</w:t>
+      </w:r>
+    </w:p>
+    <w:bookmarkEnd w:id="37"/>
     <w:sectPr>
       <w:headerReference r:id="rId7" w:type="default"/>
       <w:footerReference r:id="rId8" w:type="default"/>
@@ -1782,6 +2417,176 @@
       </w:rPr>
     </w:lvl>
   </w:abstractNum>
+  <w:abstractNum w:abstractNumId="99412">
+    <w:nsid w:val="00A99412"/>
+    <w:multiLevelType w:val="multilevel"/>
+    <w:lvl w:ilvl="0">
+      <w:start w:val="2"/>
+      <w:numFmt w:val="decimal"/>
+      <w:lvlText w:val="%1."/>
+      <w:lvlJc w:val="left"/>
+      <w:pPr>
+        <w:ind w:left="720" w:hanging="360"/>
+      </w:pPr>
+    </w:lvl>
+    <w:lvl w:ilvl="1">
+      <w:start w:val="2"/>
+      <w:numFmt w:val="decimal"/>
+      <w:lvlText w:val="%2."/>
+      <w:lvlJc w:val="left"/>
+      <w:pPr>
+        <w:ind w:left="1440" w:hanging="360"/>
+      </w:pPr>
+    </w:lvl>
+    <w:lvl w:ilvl="2">
+      <w:start w:val="2"/>
+      <w:numFmt w:val="decimal"/>
+      <w:lvlText w:val="%3."/>
+      <w:lvlJc w:val="left"/>
+      <w:pPr>
+        <w:ind w:left="2160" w:hanging="360"/>
+      </w:pPr>
+    </w:lvl>
+    <w:lvl w:ilvl="3">
+      <w:start w:val="2"/>
+      <w:numFmt w:val="decimal"/>
+      <w:lvlText w:val="%4."/>
+      <w:lvlJc w:val="left"/>
+      <w:pPr>
+        <w:ind w:left="2880" w:hanging="360"/>
+      </w:pPr>
+    </w:lvl>
+    <w:lvl w:ilvl="4">
+      <w:start w:val="2"/>
+      <w:numFmt w:val="decimal"/>
+      <w:lvlText w:val="%5."/>
+      <w:lvlJc w:val="left"/>
+      <w:pPr>
+        <w:ind w:left="3600" w:hanging="360"/>
+      </w:pPr>
+    </w:lvl>
+    <w:lvl w:ilvl="5">
+      <w:start w:val="2"/>
+      <w:numFmt w:val="decimal"/>
+      <w:lvlText w:val="%6."/>
+      <w:lvlJc w:val="left"/>
+      <w:pPr>
+        <w:ind w:left="4320" w:hanging="360"/>
+      </w:pPr>
+    </w:lvl>
+    <w:lvl w:ilvl="6">
+      <w:start w:val="2"/>
+      <w:numFmt w:val="decimal"/>
+      <w:lvlText w:val="%7."/>
+      <w:lvlJc w:val="left"/>
+      <w:pPr>
+        <w:ind w:left="5040" w:hanging="360"/>
+      </w:pPr>
+    </w:lvl>
+    <w:lvl w:ilvl="7">
+      <w:start w:val="2"/>
+      <w:numFmt w:val="decimal"/>
+      <w:lvlText w:val="%8."/>
+      <w:lvlJc w:val="left"/>
+      <w:pPr>
+        <w:ind w:left="5760" w:hanging="360"/>
+      </w:pPr>
+    </w:lvl>
+    <w:lvl w:ilvl="8">
+      <w:start w:val="2"/>
+      <w:numFmt w:val="decimal"/>
+      <w:lvlText w:val="%9."/>
+      <w:lvlJc w:val="left"/>
+      <w:pPr>
+        <w:ind w:left="6480" w:hanging="360"/>
+      </w:pPr>
+    </w:lvl>
+  </w:abstractNum>
+  <w:abstractNum w:abstractNumId="99413">
+    <w:nsid w:val="00A99413"/>
+    <w:multiLevelType w:val="multilevel"/>
+    <w:lvl w:ilvl="0">
+      <w:start w:val="3"/>
+      <w:numFmt w:val="decimal"/>
+      <w:lvlText w:val="%1."/>
+      <w:lvlJc w:val="left"/>
+      <w:pPr>
+        <w:ind w:left="720" w:hanging="360"/>
+      </w:pPr>
+    </w:lvl>
+    <w:lvl w:ilvl="1">
+      <w:start w:val="3"/>
+      <w:numFmt w:val="decimal"/>
+      <w:lvlText w:val="%2."/>
+      <w:lvlJc w:val="left"/>
+      <w:pPr>
+        <w:ind w:left="1440" w:hanging="360"/>
+      </w:pPr>
+    </w:lvl>
+    <w:lvl w:ilvl="2">
+      <w:start w:val="3"/>
+      <w:numFmt w:val="decimal"/>
+      <w:lvlText w:val="%3."/>
+      <w:lvlJc w:val="left"/>
+      <w:pPr>
+        <w:ind w:left="2160" w:hanging="360"/>
+      </w:pPr>
+    </w:lvl>
+    <w:lvl w:ilvl="3">
+      <w:start w:val="3"/>
+      <w:numFmt w:val="decimal"/>
+      <w:lvlText w:val="%4."/>
+      <w:lvlJc w:val="left"/>
+      <w:pPr>
+        <w:ind w:left="2880" w:hanging="360"/>
+      </w:pPr>
+    </w:lvl>
+    <w:lvl w:ilvl="4">
+      <w:start w:val="3"/>
+      <w:numFmt w:val="decimal"/>
+      <w:lvlText w:val="%5."/>
+      <w:lvlJc w:val="left"/>
+      <w:pPr>
+        <w:ind w:left="3600" w:hanging="360"/>
+      </w:pPr>
+    </w:lvl>
+    <w:lvl w:ilvl="5">
+      <w:start w:val="3"/>
+      <w:numFmt w:val="decimal"/>
+      <w:lvlText w:val="%6."/>
+      <w:lvlJc w:val="left"/>
+      <w:pPr>
+        <w:ind w:left="4320" w:hanging="360"/>
+      </w:pPr>
+    </w:lvl>
+    <w:lvl w:ilvl="6">
+      <w:start w:val="3"/>
+      <w:numFmt w:val="decimal"/>
+      <w:lvlText w:val="%7."/>
+      <w:lvlJc w:val="left"/>
+      <w:pPr>
+        <w:ind w:left="5040" w:hanging="360"/>
+      </w:pPr>
+    </w:lvl>
+    <w:lvl w:ilvl="7">
+      <w:start w:val="3"/>
+      <w:numFmt w:val="decimal"/>
+      <w:lvlText w:val="%8."/>
+      <w:lvlJc w:val="left"/>
+      <w:pPr>
+        <w:ind w:left="5760" w:hanging="360"/>
+      </w:pPr>
+    </w:lvl>
+    <w:lvl w:ilvl="8">
+      <w:start w:val="3"/>
+      <w:numFmt w:val="decimal"/>
+      <w:lvlText w:val="%9."/>
+      <w:lvlJc w:val="left"/>
+      <w:pPr>
+        <w:ind w:left="6480" w:hanging="360"/>
+      </w:pPr>
+    </w:lvl>
+  </w:abstractNum>
   <w:num w:numId="1">
     <w:abstractNumId w:val="1"/>
     <w:lvlOverride w:ilvl="0">
@@ -1865,6 +2670,126 @@
   </w:num>
   <w:num w:numId="1003">
     <w:abstractNumId w:val="991"/>
+  </w:num>
+  <w:num w:numId="1004">
+    <w:abstractNumId w:val="99411"/>
+    <w:lvlOverride w:ilvl="0">
+      <w:startOverride w:val="1"/>
+    </w:lvlOverride>
+    <w:lvlOverride w:ilvl="1">
+      <w:startOverride w:val="1"/>
+    </w:lvlOverride>
+    <w:lvlOverride w:ilvl="2">
+      <w:startOverride w:val="1"/>
+    </w:lvlOverride>
+    <w:lvlOverride w:ilvl="3">
+      <w:startOverride w:val="1"/>
+    </w:lvlOverride>
+    <w:lvlOverride w:ilvl="4">
+      <w:startOverride w:val="1"/>
+    </w:lvlOverride>
+    <w:lvlOverride w:ilvl="5">
+      <w:startOverride w:val="1"/>
+    </w:lvlOverride>
+    <w:lvlOverride w:ilvl="6">
+      <w:startOverride w:val="1"/>
+    </w:lvlOverride>
+    <w:lvlOverride w:ilvl="7">
+      <w:startOverride w:val="1"/>
+    </w:lvlOverride>
+    <w:lvlOverride w:ilvl="8">
+      <w:startOverride w:val="1"/>
+    </w:lvlOverride>
+  </w:num>
+  <w:num w:numId="1005">
+    <w:abstractNumId w:val="99412"/>
+    <w:lvlOverride w:ilvl="0">
+      <w:startOverride w:val="2"/>
+    </w:lvlOverride>
+    <w:lvlOverride w:ilvl="1">
+      <w:startOverride w:val="2"/>
+    </w:lvlOverride>
+    <w:lvlOverride w:ilvl="2">
+      <w:startOverride w:val="2"/>
+    </w:lvlOverride>
+    <w:lvlOverride w:ilvl="3">
+      <w:startOverride w:val="2"/>
+    </w:lvlOverride>
+    <w:lvlOverride w:ilvl="4">
+      <w:startOverride w:val="2"/>
+    </w:lvlOverride>
+    <w:lvlOverride w:ilvl="5">
+      <w:startOverride w:val="2"/>
+    </w:lvlOverride>
+    <w:lvlOverride w:ilvl="6">
+      <w:startOverride w:val="2"/>
+    </w:lvlOverride>
+    <w:lvlOverride w:ilvl="7">
+      <w:startOverride w:val="2"/>
+    </w:lvlOverride>
+    <w:lvlOverride w:ilvl="8">
+      <w:startOverride w:val="2"/>
+    </w:lvlOverride>
+  </w:num>
+  <w:num w:numId="1006">
+    <w:abstractNumId w:val="99413"/>
+    <w:lvlOverride w:ilvl="0">
+      <w:startOverride w:val="3"/>
+    </w:lvlOverride>
+    <w:lvlOverride w:ilvl="1">
+      <w:startOverride w:val="3"/>
+    </w:lvlOverride>
+    <w:lvlOverride w:ilvl="2">
+      <w:startOverride w:val="3"/>
+    </w:lvlOverride>
+    <w:lvlOverride w:ilvl="3">
+      <w:startOverride w:val="3"/>
+    </w:lvlOverride>
+    <w:lvlOverride w:ilvl="4">
+      <w:startOverride w:val="3"/>
+    </w:lvlOverride>
+    <w:lvlOverride w:ilvl="5">
+      <w:startOverride w:val="3"/>
+    </w:lvlOverride>
+    <w:lvlOverride w:ilvl="6">
+      <w:startOverride w:val="3"/>
+    </w:lvlOverride>
+    <w:lvlOverride w:ilvl="7">
+      <w:startOverride w:val="3"/>
+    </w:lvlOverride>
+    <w:lvlOverride w:ilvl="8">
+      <w:startOverride w:val="3"/>
+    </w:lvlOverride>
+  </w:num>
+  <w:num w:numId="1007">
+    <w:abstractNumId w:val="99411"/>
+    <w:lvlOverride w:ilvl="0">
+      <w:startOverride w:val="1"/>
+    </w:lvlOverride>
+    <w:lvlOverride w:ilvl="1">
+      <w:startOverride w:val="1"/>
+    </w:lvlOverride>
+    <w:lvlOverride w:ilvl="2">
+      <w:startOverride w:val="1"/>
+    </w:lvlOverride>
+    <w:lvlOverride w:ilvl="3">
+      <w:startOverride w:val="1"/>
+    </w:lvlOverride>
+    <w:lvlOverride w:ilvl="4">
+      <w:startOverride w:val="1"/>
+    </w:lvlOverride>
+    <w:lvlOverride w:ilvl="5">
+      <w:startOverride w:val="1"/>
+    </w:lvlOverride>
+    <w:lvlOverride w:ilvl="6">
+      <w:startOverride w:val="1"/>
+    </w:lvlOverride>
+    <w:lvlOverride w:ilvl="7">
+      <w:startOverride w:val="1"/>
+    </w:lvlOverride>
+    <w:lvlOverride w:ilvl="8">
+      <w:startOverride w:val="1"/>
+    </w:lvlOverride>
   </w:num>
 </w:numbering>
 </file>

</xml_diff>